<commit_message>
v33: V3 Score and parts prepared
</commit_message>
<xml_diff>
--- a/2 Proofreading and Review/LARA Mosaic Maze - Errata_v4 (Updates after v2).docx
+++ b/2 Proofreading and Review/LARA Mosaic Maze - Errata_v4 (Updates after v2).docx
@@ -303,48 +303,24 @@
           <w:ilvl w:val="0"/>
           <w:numId w:val="1"/>
         </w:numPr>
-        <w:rPr>
-          <w:b/>
-          <w:bCs/>
-        </w:rPr>
-      </w:pPr>
-      <w:r>
-        <w:rPr>
-          <w:b/>
-          <w:bCs/>
-        </w:rPr>
+      </w:pPr>
+      <w:r>
         <w:t xml:space="preserve">M37-51, Tutti: conductor asked me if </w:t>
       </w:r>
       <w:proofErr w:type="gramStart"/>
       <w:r>
-        <w:rPr>
-          <w:b/>
-          <w:bCs/>
-        </w:rPr>
         <w:t>possible</w:t>
       </w:r>
       <w:proofErr w:type="gramEnd"/>
       <w:r>
-        <w:rPr>
-          <w:b/>
-          <w:bCs/>
-        </w:rPr>
         <w:t xml:space="preserve"> to make beat size more homogeneous. I realize that this is because of </w:t>
       </w:r>
       <w:proofErr w:type="spellStart"/>
       <w:r>
-        <w:rPr>
-          <w:b/>
-          <w:bCs/>
-        </w:rPr>
         <w:t>gracenotes</w:t>
       </w:r>
       <w:proofErr w:type="spellEnd"/>
       <w:r>
-        <w:rPr>
-          <w:b/>
-          <w:bCs/>
-        </w:rPr>
         <w:t>, especially the group of 13 that often makes respective beat too large on the page and previous/following beat too small. I assume it will be impossible to fix this completely, but if you could tweak a bit so that some of the beats that are squashed can be a little bigger (and some of the huge beats a little smaller)</w:t>
       </w:r>
     </w:p>
@@ -1806,30 +1782,26 @@
           <w:numId w:val="1"/>
         </w:numPr>
         <w:rPr>
-          <w:b/>
-          <w:bCs/>
-        </w:rPr>
-      </w:pPr>
-      <w:r>
-        <w:rPr>
-          <w:b/>
-          <w:bCs/>
+          <w:strike/>
+        </w:rPr>
+      </w:pPr>
+      <w:r>
+        <w:rPr>
+          <w:strike/>
         </w:rPr>
         <w:t xml:space="preserve">M172, oboe: add natural to </w:t>
       </w:r>
       <w:proofErr w:type="gramStart"/>
       <w:r>
         <w:rPr>
-          <w:b/>
-          <w:bCs/>
+          <w:strike/>
         </w:rPr>
         <w:t>E</w:t>
       </w:r>
       <w:proofErr w:type="gramEnd"/>
       <w:r>
         <w:rPr>
-          <w:b/>
-          <w:bCs/>
+          <w:strike/>
         </w:rPr>
         <w:t xml:space="preserve"> </w:t>
       </w:r>
@@ -1961,42 +1933,22 @@
           <w:ilvl w:val="0"/>
           <w:numId w:val="1"/>
         </w:numPr>
-        <w:rPr>
-          <w:b/>
-          <w:bCs/>
-        </w:rPr>
-      </w:pPr>
-      <w:r>
-        <w:rPr>
-          <w:b/>
-          <w:bCs/>
-        </w:rPr>
+      </w:pPr>
+      <w:r>
         <w:t xml:space="preserve">M177, Perc 1: clean up grace notes (make them more </w:t>
       </w:r>
       <w:proofErr w:type="spellStart"/>
       <w:r>
-        <w:rPr>
-          <w:b/>
-          <w:bCs/>
-        </w:rPr>
         <w:t>equaly</w:t>
       </w:r>
       <w:proofErr w:type="spellEnd"/>
       <w:r>
-        <w:rPr>
-          <w:b/>
-          <w:bCs/>
-        </w:rPr>
         <w:t xml:space="preserve"> spaced and visually not lasting as long as beat 3 as they currently are</w:t>
       </w:r>
     </w:p>
     <w:p>
       <w:pPr>
         <w:pStyle w:val="ListParagraph"/>
-        <w:rPr>
-          <w:b/>
-          <w:bCs/>
-        </w:rPr>
       </w:pPr>
     </w:p>
     <w:p>
@@ -2014,90 +1966,50 @@
     <w:p>
       <w:pPr>
         <w:pStyle w:val="ListParagraph"/>
-        <w:rPr>
-          <w:b/>
-          <w:bCs/>
-        </w:rPr>
-      </w:pPr>
-    </w:p>
-    <w:p>
-      <w:pPr>
-        <w:pStyle w:val="ListParagraph"/>
-        <w:numPr>
-          <w:ilvl w:val="0"/>
-          <w:numId w:val="1"/>
-        </w:numPr>
-        <w:rPr>
-          <w:b/>
-          <w:bCs/>
-        </w:rPr>
-      </w:pPr>
-      <w:r>
-        <w:rPr>
-          <w:b/>
-          <w:bCs/>
-        </w:rPr>
+      </w:pPr>
+    </w:p>
+    <w:p>
+      <w:pPr>
+        <w:pStyle w:val="ListParagraph"/>
+        <w:numPr>
+          <w:ilvl w:val="0"/>
+          <w:numId w:val="1"/>
+        </w:numPr>
+      </w:pPr>
+      <w:r>
         <w:t xml:space="preserve">M180, clarinet and sax: clean up grace notes (make them more </w:t>
       </w:r>
       <w:proofErr w:type="spellStart"/>
       <w:r>
-        <w:rPr>
-          <w:b/>
-          <w:bCs/>
-        </w:rPr>
         <w:t>equaly</w:t>
       </w:r>
       <w:proofErr w:type="spellEnd"/>
       <w:r>
-        <w:rPr>
-          <w:b/>
-          <w:bCs/>
-        </w:rPr>
         <w:t xml:space="preserve"> spaced and visually)</w:t>
       </w:r>
     </w:p>
     <w:p>
       <w:pPr>
         <w:pStyle w:val="ListParagraph"/>
-        <w:rPr>
-          <w:b/>
-          <w:bCs/>
-        </w:rPr>
-      </w:pPr>
-    </w:p>
-    <w:p>
-      <w:pPr>
-        <w:pStyle w:val="ListParagraph"/>
-        <w:numPr>
-          <w:ilvl w:val="0"/>
-          <w:numId w:val="1"/>
-        </w:numPr>
-        <w:rPr>
-          <w:b/>
-          <w:bCs/>
-        </w:rPr>
-      </w:pPr>
-      <w:r>
-        <w:rPr>
-          <w:b/>
-          <w:bCs/>
-        </w:rPr>
+      </w:pPr>
+    </w:p>
+    <w:p>
+      <w:pPr>
+        <w:pStyle w:val="ListParagraph"/>
+        <w:numPr>
+          <w:ilvl w:val="0"/>
+          <w:numId w:val="1"/>
+        </w:numPr>
+      </w:pPr>
+      <w:r>
         <w:t xml:space="preserve">M181, Cello and Viola: clean up grace notes (make them more </w:t>
       </w:r>
       <w:proofErr w:type="spellStart"/>
       <w:r>
-        <w:rPr>
-          <w:b/>
-          <w:bCs/>
-        </w:rPr>
         <w:t>equaly</w:t>
       </w:r>
       <w:proofErr w:type="spellEnd"/>
       <w:r>
-        <w:rPr>
-          <w:b/>
-          <w:bCs/>
-        </w:rPr>
         <w:t xml:space="preserve"> spaced and visually)</w:t>
       </w:r>
     </w:p>

</xml_diff>

<commit_message>
V34: Fixed v5 errata - left 5 pages to clean up and parts
</commit_message>
<xml_diff>
--- a/2 Proofreading and Review/LARA Mosaic Maze - Errata_v4 (Updates after v2).docx
+++ b/2 Proofreading and Review/LARA Mosaic Maze - Errata_v4 (Updates after v2).docx
@@ -2074,16 +2074,8 @@
           <w:ilvl w:val="0"/>
           <w:numId w:val="1"/>
         </w:numPr>
-        <w:rPr>
-          <w:b/>
-          <w:bCs/>
-        </w:rPr>
-      </w:pPr>
-      <w:r>
-        <w:rPr>
-          <w:b/>
-          <w:bCs/>
-        </w:rPr>
+      </w:pPr>
+      <w:r>
         <w:t>M182, Clarinet and Sax: make grace notes on beat 4 more compact and close to one another, not lasting as long.</w:t>
       </w:r>
     </w:p>

</xml_diff>